<commit_message>
chore: sync full project state — laudos, vialum-chat, crm-hub, protocolo, infrastructure
Includes laudo-viabilidade script improvements, vialum-chat multi-tenant auth,
crm-hub organizations/tasks modules, vialum-media, vialum-switch, infrastructure configs,
and multiple laudo outputs (Amsterdam, Essenza, Radium, Zenit, etc.)

Co-Authored-By: Claude Opus 4.6 (1M context) <noreply@anthropic.com>
</commit_message>
<xml_diff>
--- a/laudos/Equipe Amsterdam/Amsterdam/Amsterdam - LAUDO DE VIABILIDADE.docx
+++ b/laudos/Equipe Amsterdam/Amsterdam/Amsterdam - LAUDO DE VIABILIDADE.docx
@@ -419,7 +419,7 @@
           <w:sz w:val="24"/>
           <w:u w:val="none"/>
         </w:rPr>
-        <w:t>Nesta seção, iremos expor nossas sugestões sobre quais classes independentes são aconselháveis para registro conforme o seguimento da empresa. Sabe-se que a empresa tem como atividade o desenvolvimento de serviços de marketing digital, englobando gestão de campanhas, produção de conteúdo, tráfego pago, criação de identidade visual e estratégias de presença digital para terceiros.</w:t>
+        <w:t>Nesta seção, iremos expor nossas sugestões sobre quais classes independentes são aconselháveis para registro conforme o seguimento da empresa. Sabe-se que a empresa tem como atividade agência de marketing digital.</w:t>
       </w:r>
     </w:p>
     <w:p>
@@ -457,7 +457,7 @@
           <w:sz w:val="24"/>
           <w:u w:val="none"/>
         </w:rPr>
-        <w:t xml:space="preserve"> – Publicidade; propaganda; marketing; publicidade on-line em rede de computadores; estudos de marketing; pesquisa de marketing; relações públicas; serviços de agências de publicidade; promoção de vendas para terceiros; desenvolvimento de conceitos de campanha publicitária; marketing direcionado; otimização de ferramenta de busca para fins de promoção de vendas; publicidade pay-per-click; serviços de geração de leads; marketing por influenciadores; consultoria referente a estratégias de comunicação em publicidade; desenvolvimento de conceitos de marketing; serviços publicitários para criar a identidade da marca para terceiros; redação de textos publicitários; serviços de layout para fins publicitários; promoção de produtos por meio de influenciadores.</w:t>
+        <w:t xml:space="preserve"> – Publicidade; propaganda; serviços de agências de publicidade; serviços de agências de propaganda; marketing; pesquisa de marketing; estudos de marketing; publicidade on-line em rede de computadores; otimização de ferramenta de busca para fins de promoção de vendas; otimização de tráfego de website; publicidade pay-per-click; desenvolvimento de conceitos de campanha publicitária; desenvolvimento de conceitos de marketing; marketing por influenciadores; promoção de produtos por meio de influenciadores; serviços de layout para fins publicitários; redação de textos publicitários; marketing direcionado; serviços de geração de leads [marketing]; promoção de vendas para terceiros; consultoria referente a estratégias de comunicação em publicidade; serviços publicitários para criar a identidade da marca para terceiros.</w:t>
       </w:r>
     </w:p>
     <w:p>
@@ -475,7 +475,7 @@
           <w:sz w:val="24"/>
           <w:u w:val="none"/>
         </w:rPr>
-        <w:t>A Classe 35 constitui o núcleo jurídico irredutível do portfólio registral de uma agência de marketing digital. É nela que residem, de forma expressa e específica, os serviços de publicidade, propaganda, marketing e gestão de campanhas — o que representa, em essência, a atividade-fim da empresa. O registro nesta classe assegura à Equipe Amsterdam a exclusividade de exploração da marca AMSTERDAM no segmento de agenciamento publicitário e prestação de serviços de marketing em sentido amplo, blindando-a contra o surgimento de concorrentes diretos que possam se valer da mesma denominação para capturar clientela no mesmo mercado.</w:t>
+        <w:t>A Classe 35 constitui o núcleo essencial da proteção marcária para uma agência de marketing digital. Abrange a totalidade dos serviços de publicidade, propaganda, marketing e promoção que compõem a atividade-fim da empresa. Sem esta classe, a marca ficaria desprotegida exatamente no segmento em que atua.</w:t>
       </w:r>
     </w:p>
     <w:p>
@@ -513,7 +513,7 @@
           <w:sz w:val="24"/>
           <w:u w:val="none"/>
         </w:rPr>
-        <w:t xml:space="preserve"> – Criação e manutenção de websites para terceiros; hospedagem de websites; design gráfico de material promocional; serviços de criação em artes gráficas; consultoria em design de websites; serviços de desenhos de logomarcas e assinaturas visuais; elaboração de software de computador; fornecimento de mecanismos de busca para a internet; software como serviço; consultoria tecnológica.</w:t>
+        <w:t xml:space="preserve"> – Criação e manutenção de websites para terceiros; elaboração [concepção] de software de computador; consultoria em design de websites; design gráfico de material promocional; serviços de criação em artes gráficas; serviços de desenhos [design] de logomarcas; serviços de desenhos [design] de assinaturas visuais; software como serviço [SaaS]; hospedagem de websites; consultoria tecnológica; consultoria em tecnologia da computação.</w:t>
       </w:r>
     </w:p>
     <w:p>
@@ -531,7 +531,7 @@
           <w:sz w:val="24"/>
           <w:u w:val="none"/>
         </w:rPr>
-        <w:t>A componente tecnológica é inseparável da prática contemporânea do marketing digital. Agências do setor frequentemente oferecem — ou subcontratam — serviços de criação e manutenção de websites, desenvolvimento de identidade visual, design gráfico e consultoria em plataformas digitais. A Classe 42 protege especificamente essa camada técnica e criativa da operação, garantindo que o nome AMSTERDAM não possa ser explorado por concorrentes que atuem na interface entre comunicação e tecnologia. A proteção combinada entre as Classes 35 e 42 constitui o padrão recomendado para agências de marketing digital de qualquer porte.</w:t>
+        <w:t>A Classe 42 protege os serviços técnicos e digitais que uma agência de marketing digital necessariamente presta. Criação de websites, design gráfico, desenvolvimento de identidade visual e soluções tecnológicas são entregas recorrentes no portfólio de agências deste segmento. A ausência desta classe deixaria vulnerável toda a dimensão técnico-digital da operação.</w:t>
       </w:r>
     </w:p>
     <w:p>
@@ -558,7 +558,7 @@
           <w:sz w:val="26"/>
           <w:u w:val="none"/>
         </w:rPr>
-        <w:t>Classe 38 (recomendável)</w:t>
+        <w:t>Classe 41 (recomendável)</w:t>
       </w:r>
       <w:r>
         <w:rPr>
@@ -569,7 +569,7 @@
           <w:sz w:val="24"/>
           <w:u w:val="none"/>
         </w:rPr>
-        <w:t xml:space="preserve"> – Transmissão de arquivos digitais; transmissão de podcasts; streaming de dados; provimento de acesso à rede global de computadores; transmissão de mensagens e de imagens por meio de computador; provimento de fóruns on-line.</w:t>
+        <w:t xml:space="preserve"> – Produção de filmes, exceto para fins de publicidade; produção de shows; provimento de publicações eletrônicas on-line, não baixáveis; publicação on-line de livros e periódicos eletrônicos; editoração eletrônica; filmagem em vídeo; produção de podcasts; fotografia; produção musical; serviços de edição de vídeos para eventos.</w:t>
       </w:r>
     </w:p>
     <w:p>
@@ -587,7 +587,63 @@
           <w:sz w:val="24"/>
           <w:u w:val="none"/>
         </w:rPr>
-        <w:t>A Classe 38, embora de natureza mais periférica em relação à atividade-fim da agência, guarda sinergia relevante com as estratégias de conteúdo e distribuição digital que compõem o repertório moderno do marketing. Agências que produzem e distribuem podcasts, transmissões ao vivo, conteúdo em streaming ou gerenciam canais de comunicação digital para clientes tocam, ainda que de forma instrumental, os serviços cobertos por esta classe. O registro preventivo em Classe 38 amplia o escudo registral da marca AMSTERDAM, dificultando que terceiros utilizem o mesmo sinal em atividades de telecomunicação e comunicação digital que possam se confundir com a prestação de serviços da agência.</w:t>
+        <w:t>A Classe 41 protege serviços de produção de conteúdo que agências de marketing digital frequentemente oferecem como parte de suas campanhas — produção de vídeos, podcasts, conteúdo editorial e fotografia. Embora estes serviços possam ser instrumentais à publicidade (coberta pela Classe 35), a produção de conteúdo em si possui proteção autônoma nesta classe.</w:t>
+      </w:r>
+    </w:p>
+    <w:p>
+      <w:pPr>
+        <w:spacing w:before="480" w:after="240" w:line="360" w:lineRule="auto"/>
+        <w:ind w:firstLine="0"/>
+      </w:pPr>
+      <w:r>
+        <w:rPr>
+          <w:rFonts w:ascii="Sora" w:hAnsi="Sora" w:eastAsia="Sora" w:cs="Sora"/>
+          <w:b w:val="0"/>
+          <w:caps w:val="0"/>
+          <w:color w:val="595959"/>
+          <w:sz w:val="24"/>
+          <w:u w:val="none"/>
+        </w:rPr>
+      </w:r>
+      <w:r>
+        <w:rPr>
+          <w:rFonts w:ascii="Sora" w:hAnsi="Sora" w:eastAsia="Sora" w:cs="Sora"/>
+          <w:b/>
+          <w:caps w:val="0"/>
+          <w:color w:val="9FEC14"/>
+          <w:sz w:val="26"/>
+          <w:u w:val="none"/>
+        </w:rPr>
+        <w:t>Classe 38 (possui sinergia)</w:t>
+      </w:r>
+      <w:r>
+        <w:rPr>
+          <w:rFonts w:ascii="Sora" w:hAnsi="Sora" w:eastAsia="Sora" w:cs="Sora"/>
+          <w:b w:val="0"/>
+          <w:caps w:val="0"/>
+          <w:color w:val="595959"/>
+          <w:sz w:val="24"/>
+          <w:u w:val="none"/>
+        </w:rPr>
+        <w:t xml:space="preserve"> – Transmissão de mensagens e de imagens por meio de computador; provimento de acesso a banco de dados; streaming de dados [distribuição de dados]; transmissão de vídeo sob demanda; transmissão de podcasts; provimento de fóruns on-line.</w:t>
+      </w:r>
+    </w:p>
+    <w:p>
+      <w:pPr>
+        <w:spacing w:after="240" w:line="360" w:lineRule="auto"/>
+        <w:ind w:firstLine="1701"/>
+        <w:jc w:val="both"/>
+      </w:pPr>
+      <w:r>
+        <w:rPr>
+          <w:rFonts w:ascii="Sora" w:hAnsi="Sora" w:eastAsia="Sora" w:cs="Sora"/>
+          <w:b w:val="0"/>
+          <w:caps w:val="0"/>
+          <w:color w:val="595959"/>
+          <w:sz w:val="24"/>
+          <w:u w:val="none"/>
+        </w:rPr>
+        <w:t>A Classe 38 possui sinergia com a atividade de marketing digital na medida em que cobre os serviços de telecomunicação e transmissão digital — canais pelos quais as campanhas de marketing são distribuídas. Para uma agência que opera plataformas próprias de distribuição de conteúdo ou gestão de comunidades online, esta classe oferece camada adicional de proteção.</w:t>
       </w:r>
     </w:p>
     <w:p>
@@ -630,29 +686,7 @@
           <w:sz w:val="24"/>
           <w:u w:val="none"/>
         </w:rPr>
-        <w:t xml:space="preserve">O sinal marcário AMSTERDAM consiste no topônimo da capital do Reino dos Países Baixos, transplantado para o campo dos serviços de marketing digital. Sob o prisma da </w:t>
-      </w:r>
-      <w:r>
-        <w:rPr>
-          <w:rFonts w:ascii="Sora" w:hAnsi="Sora" w:eastAsia="Sora" w:cs="Sora"/>
-          <w:b/>
-          <w:caps w:val="0"/>
-          <w:color w:val="595959"/>
-          <w:sz w:val="24"/>
-          <w:u w:val="none"/>
-        </w:rPr>
-        <w:t>VERACIDADE</w:t>
-      </w:r>
-      <w:r>
-        <w:rPr>
-          <w:rFonts w:ascii="Sora" w:hAnsi="Sora" w:eastAsia="Sora" w:cs="Sora"/>
-          <w:b w:val="0"/>
-          <w:caps w:val="0"/>
-          <w:color w:val="595959"/>
-          <w:sz w:val="24"/>
-          <w:u w:val="none"/>
-        </w:rPr>
-        <w:t>, o termo não representa qualquer risco de indução de erro ao consumidor: a marca não afirma, sugere nem implica que os serviços são originários da cidade homônima, que possuem qualidade intrínseca de procedência holandesa ou que guardam qualquer vínculo geográfico com aquele território. A jurisprudência consolidada do Instituto Nacional da Propriedade Industrial reconhece que topônimos estrangeiros, quando aplicados a serviços sem relação com o local designado, perdem sua conotação indicativa de procedência e passam a funcionar como elemento de fantasia nominativa. O consumidor brasileiro médio, ao se deparar com uma agência de marketing denominada AMSTERDAM, não inferirá que seus serviços emanam dos Países Baixos — compreenderá a denominação como escolha estética e identitária, à semelhança do que ocorre com inúmeras marcas de prestígio que adotam nomes geográficos estrangeiros sem qualquer vínculo funcional com o local.</w:t>
+        <w:t>O sinal marcário "Amsterdam" submete-se à análise intrínseca exigida pela Lei 9.279/96 para verificação de registrabilidade perante o INPI. Trata-se de vocábulo que designa a capital dos Países Baixos, o que impõe exame rigoroso dos três pilares fundamentais da registrabilidade.</w:t>
       </w:r>
     </w:p>
     <w:p>
@@ -670,29 +704,7 @@
           <w:sz w:val="24"/>
           <w:u w:val="none"/>
         </w:rPr>
-        <w:t xml:space="preserve">No que tange à </w:t>
-      </w:r>
-      <w:r>
-        <w:rPr>
-          <w:rFonts w:ascii="Sora" w:hAnsi="Sora" w:eastAsia="Sora" w:cs="Sora"/>
-          <w:b/>
-          <w:caps w:val="0"/>
-          <w:color w:val="595959"/>
-          <w:sz w:val="24"/>
-          <w:u w:val="none"/>
-        </w:rPr>
-        <w:t>LICEIDADE</w:t>
-      </w:r>
-      <w:r>
-        <w:rPr>
-          <w:rFonts w:ascii="Sora" w:hAnsi="Sora" w:eastAsia="Sora" w:cs="Sora"/>
-          <w:b w:val="0"/>
-          <w:caps w:val="0"/>
-          <w:color w:val="595959"/>
-          <w:sz w:val="24"/>
-          <w:u w:val="none"/>
-        </w:rPr>
-        <w:t>, o termo AMSTERDAM não se enquadra em nenhuma das hipóteses de irregistrabilidade elencadas no artigo 124 da Lei n.º 9.279/1996. O sinal não reproduz brasões, armas, medalhas ou insígnias oficiais; não contém expressões contrárias à moral, aos bons costumes ou à ordem pública; não constitui denominação técnica necessária ao serviço prestado; e tampouco reproduz ou imita nome de pessoa física ou personalidade notória sem autorização. O risco topográfico aventado pelo inciso IX do dispositivo legal — que veda indicações geográficas enganosas — não se materializa no caso em apreço, eis que os serviços de marketing digital não integram nenhum setor regulado por denominação de origem ou indicação geográfica vinculada à Holanda ou à cidade de Amsterdam. O sinal, portanto, supera o crivo da LICEIDADE sem qualquer ressalva.</w:t>
+        <w:t>No tocante à VERACIDADE, o sinal "Amsterdam" corresponde a uma indicação geográfica real — a cidade de Amsterdam, na Holanda. O exame de VERACIDADE avalia se o sinal induz o consumidor a erro quanto à origem, natureza ou qualidade do produto ou serviço. No caso em apreço, a marca "Amsterdam" aplicada a serviços de agência de marketing digital não sugere procedência geográfica holandesa dos serviços, tampouco induz a crer que os serviços sejam prestados naquela localidade. O consumidor médio brasileiro não associaria necessariamente uma agência de marketing digital a Amsterdam como local de procedência, diferentemente do que ocorreria, por exemplo, com produtos tipicamente associados à região (como queijos ou tulipas). Nesse sentido, o requisito de VERACIDADE encontra-se satisfeito, ressalvada a ponderação de que indicações geográficas reconhecidas podem encontrar restrição no artigo 124, inciso IX, da LPI.</w:t>
       </w:r>
     </w:p>
     <w:p>
@@ -710,19 +722,15 @@
           <w:sz w:val="24"/>
           <w:u w:val="none"/>
         </w:rPr>
-        <w:t xml:space="preserve">A análise de </w:t>
+        <w:t>Quanto à LICEIDADE, a análise exige verificação de que o sinal não incide em nenhuma das proibições absolutas do artigo 124 da LPI. O inciso IX veda o registro de indicação geográfica quando esta induzir falsa procedência. Contudo, a jurisprudência do INPI tem admitido o registro de nomes geográficos quando empregados em sentido ARBITRÁRIO, sem conexão direta com a atividade designada — ou seja, quando o topônimo funciona como elemento de fantasia e não como indicador de origem. "Amsterdam" para marketing digital enquadra-se nessa hipótese: o nome geográfico não descreve nem sugere a procedência dos serviços, operando como elemento evocativo de sofisticação e vanguarda. A LICEIDADE, portanto, resta preservada, desde que não haja pretensão de indicar origem holandesa dos serviços.</w:t>
       </w:r>
-      <w:r>
-        <w:rPr>
-          <w:rFonts w:ascii="Sora" w:hAnsi="Sora" w:eastAsia="Sora" w:cs="Sora"/>
-          <w:b/>
-          <w:caps w:val="0"/>
-          <w:color w:val="595959"/>
-          <w:sz w:val="24"/>
-          <w:u w:val="none"/>
-        </w:rPr>
-        <w:t>DISTINTIVIDADE</w:t>
-      </w:r>
+    </w:p>
+    <w:p>
+      <w:pPr>
+        <w:spacing w:after="240" w:line="360" w:lineRule="auto"/>
+        <w:ind w:firstLine="1701"/>
+        <w:jc w:val="both"/>
+      </w:pPr>
       <w:r>
         <w:rPr>
           <w:rFonts w:ascii="Sora" w:hAnsi="Sora" w:eastAsia="Sora" w:cs="Sora"/>
@@ -732,29 +740,7 @@
           <w:sz w:val="24"/>
           <w:u w:val="none"/>
         </w:rPr>
-        <w:t xml:space="preserve"> revela o principal ativo jurídico da marca. O sinal AMSTERDAM, ao ser aplicado ao segmento de marketing digital, enquadra-se com precisão na categoria dos sinais </w:t>
-      </w:r>
-      <w:r>
-        <w:rPr>
-          <w:rFonts w:ascii="Sora" w:hAnsi="Sora" w:eastAsia="Sora" w:cs="Sora"/>
-          <w:b/>
-          <w:caps w:val="0"/>
-          <w:color w:val="595959"/>
-          <w:sz w:val="24"/>
-          <w:u w:val="none"/>
-        </w:rPr>
-        <w:t>ARBITRÁRIOS</w:t>
-      </w:r>
-      <w:r>
-        <w:rPr>
-          <w:rFonts w:ascii="Sora" w:hAnsi="Sora" w:eastAsia="Sora" w:cs="Sora"/>
-          <w:b w:val="0"/>
-          <w:caps w:val="0"/>
-          <w:color w:val="595959"/>
-          <w:sz w:val="24"/>
-          <w:u w:val="none"/>
-        </w:rPr>
-        <w:t xml:space="preserve"> — aquela segunda categoria da escala valorativa do INPI, correspondente a termos com significado próprio no vocabulário comum, mas desprovidos de qualquer relação semântica, evocativa ou descritiva com os serviços que pretendem identificar. Computadores, estratégias de tráfego pago, gestão de redes sociais, criação de conteúdo digital — nenhum desses elementos encontra correspondência no universo semiótico do topônimo holandês. Essa ausência de nexo é precisamente o que confere à marca sua robustez registral: o INPI, ao apreciar o pedido, não encontrará justificativa para enquadrá-la como descritiva ou evocativa do serviço, e tampouco como fraca pelo uso excessivo do termo no setor. A força arbitrária do sinal traduz-se em alto potencial de exclusividade, tornando AMSTERDAM um ativo valioso para o posicionamento da agência no mercado.</w:t>
+        <w:t>No campo da DISTINTIVIDADE — requisito mais sensível neste caso — o sinal "Amsterdam" aplicado a serviços de marketing digital transita entre o ARBITRÁRIO e o EVOCATIVO. É ARBITRÁRIO na medida em que inexiste relação lógica ou descritiva entre uma cidade europeia e a prestação de serviços de marketing digital. Simultaneamente, o sinal pode ser considerado EVOCATIVO porque o nome "Amsterdam" carrega conotações de criatividade, vanguarda, inovação e design — valores frequentemente associados à cultura holandesa e que dialogam com o universo do marketing digital. Não é DESCRITIVO, pois não descreve diretamente nenhum atributo do serviço. Não é FANTASIOSO, pois o vocábulo existe no léxico como topônimo real. A função distintiva está presente: o consumidor é capaz de identificar a origem empresarial dos serviços por meio do sinal "Amsterdam", diferenciando-o de outros prestadores no mesmo segmento. O risco principal reside na densidade marcária — sendo um nome geográfico notório, é provável que existam diversos registros de "Amsterdam" em múltiplas classes, o que pode gerar disputas de colidência. A proteção obtida será necessariamente mais restrita do que a conferida a uma marca fantasiosa, exigindo convivência com homônimos em classes não relacionadas.</w:t>
       </w:r>
     </w:p>
     <w:p>
@@ -797,7 +783,7 @@
           <w:sz w:val="24"/>
           <w:u w:val="none"/>
         </w:rPr>
-        <w:t>A varredura da base de dados do INPI nas Classes 35, 42 e 38, tendo como vetor de busca o sinal nominativo AMSTERDAM, revelou um campo marcário de densidade surpreendentemente reduzida para um topônimo de tamanha envergadura no imaginário ocidental. O universo de anterioridades localizadas restringe-se a dois pedidos de registro — ambos circunscritos a segmentos radicalmente distintos dos serviços de marketing digital ora pretendidos — o que, por si só, sinaliza favorável a viabilidade do depósito e a inexistência de concorrência direta no terreno marcário mais relevante para a atividade da Equipe Amsterdam.</w:t>
+        <w:t>O terreno marcário para o sinal "Amsterdam" apresenta uma densidade expressiva porém administrável: a busca automatizada por classe identificou 64 processos nas quatro classes de interesse (35, 42, 41 e 38), dos quais 53 são únicos após eliminação de duplicatas interclasses. Desse universo, 16 encontram-se vivos (em vigor ou aguardando exame), 8 foram indeferidos pelo INPI (constituindo jurisprudência relevante) e 29 estão extintos ou arquivados (funcionando como precedentes de convivência). O volume de anterioridades era previsível: "Amsterdam" é um topônimo mundialmente reconhecido, e o próprio histórico do INPI demonstra que dezenas de titulares distintos — de joalheiros a motéis, de museus a head shops — utilizam o vocábulo em classes variadas sem que o Instituto considere haver confusão entre eles. Essa multiplicidade de registros opera, paradoxalmente, em favor da registrabilidade: evidencia que o vocábulo funciona como elemento de fantasia setorial, não como indicador de origem exclusiva, e que o INPI reconhece essa realidade ao permitir a coexistência reiterada.</w:t>
       </w:r>
     </w:p>
     <w:p>
@@ -815,73 +801,7 @@
           <w:sz w:val="24"/>
           <w:u w:val="none"/>
         </w:rPr>
-        <w:t xml:space="preserve">O primeiro registro que merece análise é o processo </w:t>
-      </w:r>
-      <w:r>
-        <w:rPr>
-          <w:rFonts w:ascii="Sora" w:hAnsi="Sora" w:eastAsia="Sora" w:cs="Sora"/>
-          <w:b/>
-          <w:caps w:val="0"/>
-          <w:color w:val="595959"/>
-          <w:sz w:val="24"/>
-          <w:u w:val="none"/>
-        </w:rPr>
-        <w:t>937025984</w:t>
-      </w:r>
-      <w:r>
-        <w:rPr>
-          <w:rFonts w:ascii="Sora" w:hAnsi="Sora" w:eastAsia="Sora" w:cs="Sora"/>
-          <w:b w:val="0"/>
-          <w:caps w:val="0"/>
-          <w:color w:val="595959"/>
-          <w:sz w:val="24"/>
-          <w:u w:val="none"/>
-        </w:rPr>
-        <w:t xml:space="preserve">, de titularidade de </w:t>
-      </w:r>
-      <w:r>
-        <w:rPr>
-          <w:rFonts w:ascii="Sora" w:hAnsi="Sora" w:eastAsia="Sora" w:cs="Sora"/>
-          <w:b/>
-          <w:caps w:val="0"/>
-          <w:color w:val="595959"/>
-          <w:sz w:val="24"/>
-          <w:u w:val="none"/>
-        </w:rPr>
-        <w:t>AMSTERDAM MOTEL LTDA - ME</w:t>
-      </w:r>
-      <w:r>
-        <w:rPr>
-          <w:rFonts w:ascii="Sora" w:hAnsi="Sora" w:eastAsia="Sora" w:cs="Sora"/>
-          <w:b w:val="0"/>
-          <w:caps w:val="0"/>
-          <w:color w:val="595959"/>
-          <w:sz w:val="24"/>
-          <w:u w:val="none"/>
-        </w:rPr>
-        <w:t xml:space="preserve">, depositado em 14 de novembro de 2024 e atualmente em fase de aguardo de exame de mérito perante o INPI. O pedido, de natureza nominativa, foi formulado na Classe 35 da NCL(12), com especificação integralmente voltada a "negócios de gestão hoteleira". A análise da colidência exige que se confronte, com rigor, a especificação pretendida pelo colidente com a atividade da agência de marketing: de um lado, serviços de hospedagem e administração de empreendimento hoteleiro; de outro, publicidade, gestão de campanhas digitais, tráfego pago e criação de identidade visual para terceiros. A distância mercadológica entre esses dois universos é absoluta — o público-alvo não se sobrepõe, os canais de distribuição são incompatíveis e a natureza dos serviços não guarda qualquer relação de afinidade. Aplicando-se a Tese da Especialidade, que orienta a jurisprudência do INPI no reconhecimento da viabilidade de coexistência entre marcas idênticas em classes com especificações inconfundíveis, o risco de confusão ou associação na mente do consumidor é nulo. Ademais, o fato de o pedido estar aguardando exame de mérito — sem qualquer status de concessão — fragiliza ainda mais a posição do colidente, que não detém exclusividade consolidada sobre o sinal. O risco decorrente deste processo é classificado como </w:t>
-      </w:r>
-      <w:r>
-        <w:rPr>
-          <w:rFonts w:ascii="Sora" w:hAnsi="Sora" w:eastAsia="Sora" w:cs="Sora"/>
-          <w:b/>
-          <w:caps w:val="0"/>
-          <w:color w:val="595959"/>
-          <w:sz w:val="24"/>
-          <w:u w:val="none"/>
-        </w:rPr>
-        <w:t>BAIXO</w:t>
-      </w:r>
-      <w:r>
-        <w:rPr>
-          <w:rFonts w:ascii="Sora" w:hAnsi="Sora" w:eastAsia="Sora" w:cs="Sora"/>
-          <w:b w:val="0"/>
-          <w:caps w:val="0"/>
-          <w:color w:val="595959"/>
-          <w:sz w:val="24"/>
-          <w:u w:val="none"/>
-        </w:rPr>
-        <w:t>.</w:t>
+        <w:t>Na Classe 35, a investigação revelou 42 processos, dos quais 7 permanecem vivos. A anterioridade mais direta é o processo 937.025.984, depositado em 14/11/2024 por AMSTERDAM MOTEL LTDA – ME, cuja marca "AMSTERDAM" encontra-se em status de aguardando exame de mérito com especificação restrita a "negócios de gestão hoteleira". Embora a reprodução do sinal seja integral, a especificação deste registro é radicalmente diversa da atividade de marketing digital: gestão hoteleira não guarda afinidade, complementaridade ou relação de consumo com publicidade, propaganda ou marketing digital, e o consumidor médio jamais confundiria uma agência de marketing digital com um serviço de gestão de motéis — a Tese da Especialidade sustenta plenamente a convivência. O processo 828.205.132, "AMSTERDAM SAUER", de titularidade da Amsterdam Sauer Joalheiros Ltda., constitui registro em vigor na Classe 35 com especificação concentrada em "venda/comércio de metais preciosos e suas ligas", segmento sem qualquer interface com marketing digital; ademais, o elemento nominativo adicional "SAUER" diferencia suficientemente o conjunto marcário. A marca "OLYMPISCHE SPIELE – 1928 AMSTERDAM" (processo 905.647.254), do Comitê Olímpico Internacional, opera em propaganda esportiva — há afinidade parcial com o campo da propaganda, porém trata-se de marca composta de elevada complexidade cujo elemento "Amsterdam" funciona como mero indicador geográfico-histórico dentro de um conjunto muito mais amplo, sem risco de confusão com uma marca "Amsterdam" isolada para marketing digital. O mesmo raciocínio aplica-se a "VAN GOGH MUSEUM AMSTERDAM" (processo 908.680.465), da Stichting Van Gogh Museum, cuja especificação dirige-se a organização de feiras e exposições para fins comerciais ligados ao museu. A marca "AMSTERDAM HEAD SHOP" (processo 916.057.364), com especificação em assessoria e gestão de negócios, opera no nicho de head shops — atividade absolutamente diversa do marketing digital, e o elemento "HEAD SHOP" a diferencia de forma inequívoca. "AMSTERDAM CONVENIENCIA" (processo 934.144.745), com especificação em supermercado e comércio de alimentos, não guarda a menor afinidade mercadológica. "GREEN HOUSE AMSTERDAM" (processo 936.774.983), da holandesa GHSC Trading B.V., aguarda exame de mérito com especificação mais ampla que inclui "administração comercial" e "assessoria em gestão" — esta é a anterioridade que merece maior atenção na Classe 35, pois a amplitude de sua especificação poderia, em tese, tangenciar o campo do marketing; contudo, trata-se de marca composta com elemento "GREEN HOUSE" que a distingue suficientemente, e sua atividade real concentra-se no mercado de cannabis — distinto do marketing digital. Dentre as marcas mortas, destaca-se o processo 901.706.035, "AMSTERDAM" puro outrora registrado na Classe 35 com especificação em serviços editoriais, atualmente extinto, o que configura precedente de que o INPI já concedeu registro ao sinal isolado nesta classe. A análise da jurisprudência de indeferimentos revela padrão importante: o processo 913.771.767, "Amsterdam" na Classe 35, foi indeferido por reproduzir registros anteriores com base no artigo 124, inciso XIX, da LPI — demonstrando que o INPI aplica o critério de colidência quando há sobreposição de especificações entre marcas idênticas. Contudo, a marca "Amsterdam Choice" (processo 916.700.500) também foi indeferida apesar do acréscimo "Choice", indicando que elementos adicionais genéricos não salvam quando as especificações se sobrepõem diretamente. As marcas "CANNABIS STORE AMSTERDAM" (processos 915.878.682, 501.525.961 e 922.778.302) foram indeferidas por motivos diversos — reprodução de denominação de droga ilícita (Art. 124, III) e falsa indicação de procedência (Art. 124, IX) — confirmando que o elemento "Amsterdam" associado a cannabis enfrenta vedação absoluta, o que nada tem a ver com marketing digital.</w:t>
       </w:r>
     </w:p>
     <w:p>
@@ -899,139 +819,7 @@
           <w:sz w:val="24"/>
           <w:u w:val="none"/>
         </w:rPr>
-        <w:t xml:space="preserve">O segundo pedido identificado, processo </w:t>
-      </w:r>
-      <w:r>
-        <w:rPr>
-          <w:rFonts w:ascii="Sora" w:hAnsi="Sora" w:eastAsia="Sora" w:cs="Sora"/>
-          <w:b/>
-          <w:caps w:val="0"/>
-          <w:color w:val="595959"/>
-          <w:sz w:val="24"/>
-          <w:u w:val="none"/>
-        </w:rPr>
-        <w:t>913771767</w:t>
-      </w:r>
-      <w:r>
-        <w:rPr>
-          <w:rFonts w:ascii="Sora" w:hAnsi="Sora" w:eastAsia="Sora" w:cs="Sora"/>
-          <w:b w:val="0"/>
-          <w:caps w:val="0"/>
-          <w:color w:val="595959"/>
-          <w:sz w:val="24"/>
-          <w:u w:val="none"/>
-        </w:rPr>
-        <w:t xml:space="preserve">, de titularidade de </w:t>
-      </w:r>
-      <w:r>
-        <w:rPr>
-          <w:rFonts w:ascii="Sora" w:hAnsi="Sora" w:eastAsia="Sora" w:cs="Sora"/>
-          <w:b/>
-          <w:caps w:val="0"/>
-          <w:color w:val="595959"/>
-          <w:sz w:val="24"/>
-          <w:u w:val="none"/>
-        </w:rPr>
-        <w:t>GUILHERME MELO PORCARO PESSO</w:t>
-      </w:r>
-      <w:r>
-        <w:rPr>
-          <w:rFonts w:ascii="Sora" w:hAnsi="Sora" w:eastAsia="Sora" w:cs="Sora"/>
-          <w:b w:val="0"/>
-          <w:caps w:val="0"/>
-          <w:color w:val="595959"/>
-          <w:sz w:val="24"/>
-          <w:u w:val="none"/>
-        </w:rPr>
-        <w:t xml:space="preserve">, apresenta uma circunstância que, paradoxalmente, opera em favor da Equipe Amsterdam: o pedido foi </w:t>
-      </w:r>
-      <w:r>
-        <w:rPr>
-          <w:rFonts w:ascii="Sora" w:hAnsi="Sora" w:eastAsia="Sora" w:cs="Sora"/>
-          <w:b/>
-          <w:caps w:val="0"/>
-          <w:color w:val="595959"/>
-          <w:sz w:val="24"/>
-          <w:u w:val="none"/>
-        </w:rPr>
-        <w:t>indeferido</w:t>
-      </w:r>
-      <w:r>
-        <w:rPr>
-          <w:rFonts w:ascii="Sora" w:hAnsi="Sora" w:eastAsia="Sora" w:cs="Sora"/>
-          <w:b w:val="0"/>
-          <w:caps w:val="0"/>
-          <w:color w:val="595959"/>
-          <w:sz w:val="24"/>
-          <w:u w:val="none"/>
-        </w:rPr>
-        <w:t xml:space="preserve"> pelo INPI em 4 de dezembro de 2018, sem interposição de recurso, por ter incidido em colisão com registros anteriores identificados como Processo 901706035 (</w:t>
-      </w:r>
-      <w:r>
-        <w:rPr>
-          <w:rFonts w:ascii="Sora" w:hAnsi="Sora" w:eastAsia="Sora" w:cs="Sora"/>
-          <w:b/>
-          <w:caps w:val="0"/>
-          <w:color w:val="595959"/>
-          <w:sz w:val="24"/>
-          <w:u w:val="none"/>
-        </w:rPr>
-        <w:t>AMSTERDAM</w:t>
-      </w:r>
-      <w:r>
-        <w:rPr>
-          <w:rFonts w:ascii="Sora" w:hAnsi="Sora" w:eastAsia="Sora" w:cs="Sora"/>
-          <w:b w:val="0"/>
-          <w:caps w:val="0"/>
-          <w:color w:val="595959"/>
-          <w:sz w:val="24"/>
-          <w:u w:val="none"/>
-        </w:rPr>
-        <w:t>) e Processo 828205132 (</w:t>
-      </w:r>
-      <w:r>
-        <w:rPr>
-          <w:rFonts w:ascii="Sora" w:hAnsi="Sora" w:eastAsia="Sora" w:cs="Sora"/>
-          <w:b/>
-          <w:caps w:val="0"/>
-          <w:color w:val="595959"/>
-          <w:sz w:val="24"/>
-          <w:u w:val="none"/>
-        </w:rPr>
-        <w:t>AMSTERDAM SAUER</w:t>
-      </w:r>
-      <w:r>
-        <w:rPr>
-          <w:rFonts w:ascii="Sora" w:hAnsi="Sora" w:eastAsia="Sora" w:cs="Sora"/>
-          <w:b w:val="0"/>
-          <w:caps w:val="0"/>
-          <w:color w:val="595959"/>
-          <w:sz w:val="24"/>
-          <w:u w:val="none"/>
-        </w:rPr>
-        <w:t xml:space="preserve">). A especificação pretendida pelo titular indeferido cobria exclusivamente o comércio de bijuteria, chapelaria, artigos do vestuário, couro e produtos têxteis na Classe 35 — mercado da moda e varejo de acessórios, sem qualquer toque no segmento de comunicação e marketing digital. O interesse jurídico desta anterioridade para a análise presente é duplo: primeiro, confirma que o INPI já possui registros anteriores da denominação AMSTERDAM vinculados ao universo da joalheria e moda (indicando coexistência setorial histórica do topônimo em diferentes segmentos); segundo, demonstra que o indeferimento se deu por conflito intra-segmento — moda versus moda — jamais por conflito com serviços de natureza publicitária ou tecnológica. O sinal AMSTERDAM, portanto, não ostenta caráter registral absoluto que impeça novos pedidos em campos de atuação distintos. O risco oriundo deste pedido é inexistente, dado seu status de </w:t>
-      </w:r>
-      <w:r>
-        <w:rPr>
-          <w:rFonts w:ascii="Sora" w:hAnsi="Sora" w:eastAsia="Sora" w:cs="Sora"/>
-          <w:b/>
-          <w:caps w:val="0"/>
-          <w:color w:val="595959"/>
-          <w:sz w:val="24"/>
-          <w:u w:val="none"/>
-        </w:rPr>
-        <w:t>INDEFERIDO sem recurso</w:t>
-      </w:r>
-      <w:r>
-        <w:rPr>
-          <w:rFonts w:ascii="Sora" w:hAnsi="Sora" w:eastAsia="Sora" w:cs="Sora"/>
-          <w:b w:val="0"/>
-          <w:caps w:val="0"/>
-          <w:color w:val="595959"/>
-          <w:sz w:val="24"/>
-          <w:u w:val="none"/>
-        </w:rPr>
-        <w:t>.</w:t>
+        <w:t>Na Classe 42, o panorama é o mais favorável dentre todas as classes analisadas: dos 7 processos identificados, nenhum se encontra vivo com especificação que tangencia serviços de tecnologia, design ou desenvolvimento web. O processo 821.867.482, "AMSTERDAM" puro, está arquivado, e o processo 823.975.762, também "AMSTERDAM" na Classe 42, tem registro extinto — ambos funcionam como precedentes de que o INPI já admitiu o sinal nesta classe. Os demais processos — "AMSTERDAM SAUER" em diversas variações e "AMSTERDAM" em subclasses antigas — estão todos arquivados ou extintos. A ausência completa de anterioridades vivas na Classe 42 configura campo aberto para registro, particularmente quando a especificação se concentra em criação de websites, design gráfico, consultoria em tecnologia e desenvolvimento de identidade visual.</w:t>
       </w:r>
     </w:p>
     <w:p>
@@ -1049,29 +837,7 @@
           <w:sz w:val="24"/>
           <w:u w:val="none"/>
         </w:rPr>
-        <w:t xml:space="preserve">A menção, no despacho de indeferimento do processo 913771767, aos registros 901706035 e 828205132 — ambos aparentemente vinculados à marca </w:t>
-      </w:r>
-      <w:r>
-        <w:rPr>
-          <w:rFonts w:ascii="Sora" w:hAnsi="Sora" w:eastAsia="Sora" w:cs="Sora"/>
-          <w:b/>
-          <w:caps w:val="0"/>
-          <w:color w:val="595959"/>
-          <w:sz w:val="24"/>
-          <w:u w:val="none"/>
-        </w:rPr>
-        <w:t>AMSTERDAM SAUER</w:t>
-      </w:r>
-      <w:r>
-        <w:rPr>
-          <w:rFonts w:ascii="Sora" w:hAnsi="Sora" w:eastAsia="Sora" w:cs="Sora"/>
-          <w:b w:val="0"/>
-          <w:caps w:val="0"/>
-          <w:color w:val="595959"/>
-          <w:sz w:val="24"/>
-          <w:u w:val="none"/>
-        </w:rPr>
-        <w:t>, a célebre joalheria brasileira — merece atenção estratégica, ainda que esses processos não tenham aparecido diretamente na busca pelas classes de marketing digital. A Amsterdam Sauer opera no segmento de joias e alta relojoaria, consolidando sua marca no universo do luxo e varejo físico premium. A distância setorial entre joalheria e agência de marketing digital é ainda mais pronunciada do que aquela verificada em relação à Amsterdam Motel: não há sobreposição de público, de canal, de natureza do serviço nem de contexto de uso. O princípio da Tese da Especialidade e a análise do público-alvo diferenciado afastam qualquer risco de confusão relevante. Complementarmente, a postura histórica do INPI de permitir o convívio de marcas idênticas em segmentos distintos — conforme exemplificado pela própria trajetória da denominação AMSTERDAM na base — serve de precedente favorável à tese da coexistência.</w:t>
+        <w:t>Na Classe 41, a investigação revelou 12 processos, dos quais 5 permanecem vivos. A anterioridade "Amsterdam Pub" (processo 915.873.028), de titularidade da Power Empreendimentos Ltda., é registro em vigor cuja especificação abrange "produção de shows, serviços de boates, entretenimento" — atividade voltada a entretenimento presencial/noturno, sem interface com produção de conteúdo digital audiovisual. "AMSTERDAM BARTENDERS BAR PREMIUM" (processo 924.754.273), com especificação em "banda de música, organização de festas, serviços de bar", opera no mesmo nicho gastronômico-festivo e se distingue tanto pelo conjunto marcário quanto pela especificação. "AMSTERDAM AJU" (processo 935.265.694), da GDA Restaurante e Eventos Ltda., aguarda concessão com especificação em "aluguel de salão de festas, decoração de festas e cerimônias" — novamente entretenimento presencial. A marca que merece maior atenção é "Nova Amsterdam" (processo 941.478.220), da Resenha Rentável Ltda., aguardando exame de mérito com especificação que inclui "agência de modelos para artistas" — há afinidade leve com o universo criativo do marketing digital, embora a especificação se concentre em entretenimento e não em produção de conteúdo para fins publicitários. As marcas do Comitê Olímpico e do Museu Van Gogh, presentes também nesta classe, são marcas compostas de complexidade tal que o elemento "Amsterdam" funciona como indicador geográfico acessório, sem risco de confusão. O processo 917.012.640, "Amsterdam" isolado na Classe 41, foi indeferido pelo INPI por reproduzir registros anteriores — jurisprudência que confirma a necessidade de especificação precisa para obter registro nesta classe. Os processos 819.284.670 e 840.256.540 ("AMSTERDAM" e "AMSTERDAM PUB") encontram-se arquivados, e o processo 912.621.877, "amsterdam – assessoria / eventos / festas", foi definitivamente arquivado, reforçando que o campo de entretenimento presencial sob o topônimo "Amsterdam" tem alta rotatividade de titulares sem consolidação de exclusividade.</w:t>
       </w:r>
     </w:p>
     <w:p>
@@ -1089,19 +855,15 @@
           <w:sz w:val="24"/>
           <w:u w:val="none"/>
         </w:rPr>
-        <w:t xml:space="preserve">Diante do exposto, a viabilidade de registro da marca AMSTERDAM para uma agência de marketing digital é avaliada como </w:t>
+        <w:t>Na Classe 38, a investigação identificou apenas 3 processos, todos em situação de arquivamento ou extinção. Não há nenhuma anterioridade viva que reproduza ou imite o sinal "Amsterdam" nesta classe, configurando campo inteiramente livre para registro em serviços de telecomunicação e transmissão digital.</w:t>
       </w:r>
-      <w:r>
-        <w:rPr>
-          <w:rFonts w:ascii="Sora" w:hAnsi="Sora" w:eastAsia="Sora" w:cs="Sora"/>
-          <w:b/>
-          <w:caps w:val="0"/>
-          <w:color w:val="595959"/>
-          <w:sz w:val="24"/>
-          <w:u w:val="none"/>
-        </w:rPr>
-        <w:t>PROVÁVEL</w:t>
-      </w:r>
+    </w:p>
+    <w:p>
+      <w:pPr>
+        <w:spacing w:after="240" w:line="360" w:lineRule="auto"/>
+        <w:ind w:firstLine="1701"/>
+        <w:jc w:val="both"/>
+      </w:pPr>
       <w:r>
         <w:rPr>
           <w:rFonts w:ascii="Sora" w:hAnsi="Sora" w:eastAsia="Sora" w:cs="Sora"/>
@@ -1111,7 +873,7 @@
           <w:sz w:val="24"/>
           <w:u w:val="none"/>
         </w:rPr>
-        <w:t>. O campo marcário nas Classes 35, 42 e 38, recortado pelas especificações específicas de serviços de publicidade e comunicação digital, encontra-se praticamente intocado por anterioridades diretas, o que confere à Equipe Amsterdam uma janela de oportunidade registral favorável. Recomenda-se o depósito imediato nas três classes indicadas, com especificações técnicas precisas que delimitem o escopo dos serviços de marketing digital e afastem qualquer interpretação extensiva que possa conflitar com os registros existentes nos segmentos de hotelaria e joalheria. Do ponto de vista da identidade visual, a estratégia de diferenciação deve investir em uma estética contemporânea, tecnológica e minimalista — distanciando-se ativamente do universo visual da Amsterdam Sauer, caracterizado pelo luxo e pelo classicismo ornamental. O monitoramento periódico da base do INPI, especialmente do processo 937025984 da Amsterdam Motel, é recomendado para acompanhar eventuais desenvolvimentos que pudessem, em tese, gerar argumentação de coexistência na mesma classe.</w:t>
+        <w:t>O veredito de viabilidade para o registro da marca "Amsterdam" é PROVÁVEL nas quatro classes analisadas, com gradação de confiança por classe. Nas Classes 42 e 38, a viabilidade é MUITO PROVÁVEL — campo livre, sem anterioridades vivas, com precedentes de registros anteriores do mesmo sinal que validam a aceitação pelo INPI. Na Classe 41, a viabilidade é PROVÁVEL — as anterioridades vivas concentram-se em entretenimento presencial e gastronômico, sem afinidade com produção de conteúdo digital, sendo recomendável redigir a especificação de forma precisa e concentrada em produção audiovisual, editoração e publicação digital, evitando sobreposição com entretenimento presencial. Na Classe 35, a viabilidade é PROVÁVEL COM RESSALVA — a anterioridade "AMSTERDAM" da Amsterdam Motel Ltda. (processo 937.025.984) ainda aguarda exame de mérito na mesma classe, porém sua especificação restrita a gestão hoteleira não apresenta afinidade com marketing digital; a marca "GREEN HOUSE AMSTERDAM" (processo 936.774.983) também aguarda exame com especificação mais ampla, mas o conjunto marcário distinto e o segmento real de atuação (cannabis) afastam o risco de confusão. A estratégia recomendada é depositar simultaneamente nas quatro classes com especificações cuidadosamente delimitadas ao universo do marketing digital, monitorar o andamento dos processos 937.025.984 e 936.774.983 na Classe 35, e manter dossiê preparado com fundamentação na Tese da Especialidade e nos precedentes de convivência identificados nesta análise para eventual manifestação em caso de exigência ou oposição.</w:t>
       </w:r>
     </w:p>
     <w:p>
@@ -1130,7 +892,7 @@
         </w:rPr>
         <w:t>É o parecer.</w:t>
         <w:br/>
-        <w:t>27 de fevereiro de 2026.</w:t>
+        <w:t>15 de março de 2026.</w:t>
         <w:br/>
         <w:t>Equipe Genesis</w:t>
       </w:r>

</xml_diff>